<commit_message>
Complete the campaign bundle: add Google/YouTube, email, switch-over, organic
Rounds the feature-led bundle into a full cross-channel package:
- Google Search RSA (15 headlines, 4 descriptions, keywords, sitelinks,
  callouts) + YouTube/Reels 6s/15s/30s scripts.
- 5-email nurture sequence for free sign-ups/leads (welcome → AI tutor →
  Smart Review → exam practice → keep-going), each with subject, preview,
  body and CTA.
- marketwaros.com switch-over pack: what to change to reuse every asset
  (destination, UTM, message match, retarget warm audiences) + ad
  templates to fill with its offer.
- Organic social captions + hashtag set.

Co-Authored-By: Claude Opus 4.8 <noreply@anthropic.com>
Claude-Session: https://claude.ai/code/session_016PCGQbfDRdfeW6pjmsqaoQ
</commit_message>
<xml_diff>
--- a/StudYear-Facebook-Campaign-Bundle.docx
+++ b/StudYear-Facebook-Campaign-Bundle.docx
@@ -4756,6 +4756,1899 @@
       </w:pPr>
       <w:r>
         <w:t xml:space="preserve">Then: build a Custom Audience of site visitors + a 1% Lookalike — the seed audiences for when you move focus to marketwaros.com. This campaign pays forward.</w:t>
+      </w:r>
+    </w:p>
+    <w:p>
+      <w:pPr>
+        <w:spacing w:after="0"/>
+      </w:pPr>
+      <w:r>
+        <w:br w:type="page"/>
+      </w:r>
+    </w:p>
+    <w:p>
+      <w:pPr>
+        <w:pStyle w:val="Heading1"/>
+      </w:pPr>
+      <w:r>
+        <w:t xml:space="preserve">9. Google Search &amp; YouTube ads (feature-led)</w:t>
+      </w:r>
+    </w:p>
+    <w:p>
+      <w:pPr>
+        <w:spacing w:after="120"/>
+      </w:pPr>
+      <w:r>
+        <w:rPr>
+          <w:i/>
+          <w:iCs/>
+          <w:color w:val="5B6B85"/>
+        </w:rPr>
+        <w:t xml:space="preserve">Catch people already searching for what StudYear does. Paste into a Responsive Search Ad (Google Ads).</w:t>
+      </w:r>
+    </w:p>
+    <w:p>
+      <w:pPr>
+        <w:spacing w:after="40" w:before="140"/>
+      </w:pPr>
+      <w:r>
+        <w:rPr>
+          <w:b/>
+          <w:bCs/>
+          <w:color w:val="0B1B33"/>
+          <w:sz w:val="21"/>
+          <w:szCs w:val="21"/>
+        </w:rPr>
+        <w:t xml:space="preserve">Headlines — 15 (each ≤30 characters)</w:t>
+      </w:r>
+    </w:p>
+    <w:p>
+      <w:pPr>
+        <w:pBdr>
+          <w:top w:val="single" w:color="C7D2E4" w:sz="6" w:space="8"/>
+          <w:bottom w:val="single" w:color="C7D2E4" w:sz="6" w:space="8"/>
+          <w:left w:val="single" w:color="2E6BC4" w:sz="18" w:space="8"/>
+          <w:right w:val="single" w:color="C7D2E4" w:sz="6" w:space="8"/>
+        </w:pBdr>
+        <w:shd w:fill="F3F6FB" w:val="clear"/>
+        <w:spacing w:after="140" w:before="60"/>
+        <w:ind w:left="120" w:right="120"/>
+      </w:pPr>
+      <w:r>
+        <w:rPr>
+          <w:rFonts w:ascii="Consolas" w:cs="Consolas" w:eastAsia="Consolas" w:hAnsi="Consolas"/>
+          <w:sz w:val="20"/>
+          <w:szCs w:val="20"/>
+        </w:rPr>
+        <w:t xml:space="preserve">Free Predicted Grade</w:t>
+      </w:r>
+      <w:r>
+        <w:rPr>
+          <w:rFonts w:ascii="Consolas" w:cs="Consolas" w:eastAsia="Consolas" w:hAnsi="Consolas"/>
+          <w:sz w:val="20"/>
+          <w:szCs w:val="20"/>
+        </w:rPr>
+        <w:br/>
+        <w:t xml:space="preserve">AI Tutor That Teaches</w:t>
+      </w:r>
+      <w:r>
+        <w:rPr>
+          <w:rFonts w:ascii="Consolas" w:cs="Consolas" w:eastAsia="Consolas" w:hAnsi="Consolas"/>
+          <w:sz w:val="20"/>
+          <w:szCs w:val="20"/>
+        </w:rPr>
+        <w:br/>
+        <w:t xml:space="preserve">Revision That Sticks</w:t>
+      </w:r>
+      <w:r>
+        <w:rPr>
+          <w:rFonts w:ascii="Consolas" w:cs="Consolas" w:eastAsia="Consolas" w:hAnsi="Consolas"/>
+          <w:sz w:val="20"/>
+          <w:szCs w:val="20"/>
+        </w:rPr>
+        <w:br/>
+        <w:t xml:space="preserve">Free Study Plan in 60s</w:t>
+      </w:r>
+      <w:r>
+        <w:rPr>
+          <w:rFonts w:ascii="Consolas" w:cs="Consolas" w:eastAsia="Consolas" w:hAnsi="Consolas"/>
+          <w:sz w:val="20"/>
+          <w:szCs w:val="20"/>
+        </w:rPr>
+        <w:br/>
+        <w:t xml:space="preserve">Sit The Exam First</w:t>
+      </w:r>
+      <w:r>
+        <w:rPr>
+          <w:rFonts w:ascii="Consolas" w:cs="Consolas" w:eastAsia="Consolas" w:hAnsi="Consolas"/>
+          <w:sz w:val="20"/>
+          <w:szCs w:val="20"/>
+        </w:rPr>
+        <w:br/>
+        <w:t xml:space="preserve">Mark My Essay With AI</w:t>
+      </w:r>
+      <w:r>
+        <w:rPr>
+          <w:rFonts w:ascii="Consolas" w:cs="Consolas" w:eastAsia="Consolas" w:hAnsi="Consolas"/>
+          <w:sz w:val="20"/>
+          <w:szCs w:val="20"/>
+        </w:rPr>
+        <w:br/>
+        <w:t xml:space="preserve">Instant Flashcards &amp; Quizzes</w:t>
+      </w:r>
+      <w:r>
+        <w:rPr>
+          <w:rFonts w:ascii="Consolas" w:cs="Consolas" w:eastAsia="Consolas" w:hAnsi="Consolas"/>
+          <w:sz w:val="20"/>
+          <w:szCs w:val="20"/>
+        </w:rPr>
+        <w:br/>
+        <w:t xml:space="preserve">Past Papers + Mark Schemes</w:t>
+      </w:r>
+      <w:r>
+        <w:rPr>
+          <w:rFonts w:ascii="Consolas" w:cs="Consolas" w:eastAsia="Consolas" w:hAnsi="Consolas"/>
+          <w:sz w:val="20"/>
+          <w:szCs w:val="20"/>
+        </w:rPr>
+        <w:br/>
+        <w:t xml:space="preserve">GCSE &amp; A-Level Revision</w:t>
+      </w:r>
+      <w:r>
+        <w:rPr>
+          <w:rFonts w:ascii="Consolas" w:cs="Consolas" w:eastAsia="Consolas" w:hAnsi="Consolas"/>
+          <w:sz w:val="20"/>
+          <w:szCs w:val="20"/>
+        </w:rPr>
+        <w:br/>
+        <w:t xml:space="preserve">The AI Learning Platform</w:t>
+      </w:r>
+      <w:r>
+        <w:rPr>
+          <w:rFonts w:ascii="Consolas" w:cs="Consolas" w:eastAsia="Consolas" w:hAnsi="Consolas"/>
+          <w:sz w:val="20"/>
+          <w:szCs w:val="20"/>
+        </w:rPr>
+        <w:br/>
+        <w:t xml:space="preserve">Study Smarter, Not Harder</w:t>
+      </w:r>
+      <w:r>
+        <w:rPr>
+          <w:rFonts w:ascii="Consolas" w:cs="Consolas" w:eastAsia="Consolas" w:hAnsi="Consolas"/>
+          <w:sz w:val="20"/>
+          <w:szCs w:val="20"/>
+        </w:rPr>
+        <w:br/>
+        <w:t xml:space="preserve">Personalised Study Plan</w:t>
+      </w:r>
+      <w:r>
+        <w:rPr>
+          <w:rFonts w:ascii="Consolas" w:cs="Consolas" w:eastAsia="Consolas" w:hAnsi="Consolas"/>
+          <w:sz w:val="20"/>
+          <w:szCs w:val="20"/>
+        </w:rPr>
+        <w:br/>
+        <w:t xml:space="preserve">Learn Any Topic, Your Pace</w:t>
+      </w:r>
+      <w:r>
+        <w:rPr>
+          <w:rFonts w:ascii="Consolas" w:cs="Consolas" w:eastAsia="Consolas" w:hAnsi="Consolas"/>
+          <w:sz w:val="20"/>
+          <w:szCs w:val="20"/>
+        </w:rPr>
+        <w:br/>
+        <w:t xml:space="preserve">Free. No Sign-Up.</w:t>
+      </w:r>
+      <w:r>
+        <w:rPr>
+          <w:rFonts w:ascii="Consolas" w:cs="Consolas" w:eastAsia="Consolas" w:hAnsi="Consolas"/>
+          <w:sz w:val="20"/>
+          <w:szCs w:val="20"/>
+        </w:rPr>
+        <w:br/>
+        <w:t xml:space="preserve">See Your Predicted Grade</w:t>
+      </w:r>
+    </w:p>
+    <w:p>
+      <w:pPr>
+        <w:spacing w:after="40" w:before="140"/>
+      </w:pPr>
+      <w:r>
+        <w:rPr>
+          <w:b/>
+          <w:bCs/>
+          <w:color w:val="0B1B33"/>
+          <w:sz w:val="21"/>
+          <w:szCs w:val="21"/>
+        </w:rPr>
+        <w:t xml:space="preserve">Descriptions — 4 (each ≤90 characters)</w:t>
+      </w:r>
+    </w:p>
+    <w:p>
+      <w:pPr>
+        <w:pBdr>
+          <w:top w:val="single" w:color="C7D2E4" w:sz="6" w:space="8"/>
+          <w:bottom w:val="single" w:color="C7D2E4" w:sz="6" w:space="8"/>
+          <w:left w:val="single" w:color="2E6BC4" w:sz="18" w:space="8"/>
+          <w:right w:val="single" w:color="C7D2E4" w:sz="6" w:space="8"/>
+        </w:pBdr>
+        <w:shd w:fill="F3F6FB" w:val="clear"/>
+        <w:spacing w:after="140" w:before="60"/>
+        <w:ind w:left="120" w:right="120"/>
+      </w:pPr>
+      <w:r>
+        <w:rPr>
+          <w:rFonts w:ascii="Consolas" w:cs="Consolas" w:eastAsia="Consolas" w:hAnsi="Consolas"/>
+          <w:sz w:val="20"/>
+          <w:szCs w:val="20"/>
+        </w:rPr>
+        <w:t xml:space="preserve">Free predicted grade + a personalised plan in 60 seconds. No sign-up, no card.</w:t>
+      </w:r>
+      <w:r>
+        <w:rPr>
+          <w:rFonts w:ascii="Consolas" w:cs="Consolas" w:eastAsia="Consolas" w:hAnsi="Consolas"/>
+          <w:sz w:val="20"/>
+          <w:szCs w:val="20"/>
+        </w:rPr>
+        <w:br/>
+        <w:t xml:space="preserve">An AI tutor that teaches the method, not just the answer. GCSE &amp; A-Level.</w:t>
+      </w:r>
+      <w:r>
+        <w:rPr>
+          <w:rFonts w:ascii="Consolas" w:cs="Consolas" w:eastAsia="Consolas" w:hAnsi="Consolas"/>
+          <w:sz w:val="20"/>
+          <w:szCs w:val="20"/>
+        </w:rPr>
+        <w:br/>
+        <w:t xml:space="preserve">Smart Review brings back what you get wrong until it sticks. Try it free.</w:t>
+      </w:r>
+      <w:r>
+        <w:rPr>
+          <w:rFonts w:ascii="Consolas" w:cs="Consolas" w:eastAsia="Consolas" w:hAnsi="Consolas"/>
+          <w:sz w:val="20"/>
+          <w:szCs w:val="20"/>
+        </w:rPr>
+        <w:br/>
+        <w:t xml:space="preserve">Timed past papers, mark schemes and an honest predicted grade. Start free.</w:t>
+      </w:r>
+    </w:p>
+    <w:p>
+      <w:pPr>
+        <w:spacing w:after="40" w:before="140"/>
+      </w:pPr>
+      <w:r>
+        <w:rPr>
+          <w:b/>
+          <w:bCs/>
+          <w:color w:val="0B1B33"/>
+          <w:sz w:val="21"/>
+          <w:szCs w:val="21"/>
+        </w:rPr>
+        <w:t xml:space="preserve">Keywords to target (phrase/broad)</w:t>
+      </w:r>
+    </w:p>
+    <w:p>
+      <w:pPr>
+        <w:pBdr>
+          <w:top w:val="single" w:color="C7D2E4" w:sz="6" w:space="8"/>
+          <w:bottom w:val="single" w:color="C7D2E4" w:sz="6" w:space="8"/>
+          <w:left w:val="single" w:color="2E6BC4" w:sz="18" w:space="8"/>
+          <w:right w:val="single" w:color="C7D2E4" w:sz="6" w:space="8"/>
+        </w:pBdr>
+        <w:shd w:fill="F3F6FB" w:val="clear"/>
+        <w:spacing w:after="140" w:before="60"/>
+        <w:ind w:left="120" w:right="120"/>
+      </w:pPr>
+      <w:r>
+        <w:rPr>
+          <w:rFonts w:ascii="Consolas" w:cs="Consolas" w:eastAsia="Consolas" w:hAnsi="Consolas"/>
+          <w:sz w:val="20"/>
+          <w:szCs w:val="20"/>
+        </w:rPr>
+        <w:t xml:space="preserve">free predicted grade</w:t>
+      </w:r>
+      <w:r>
+        <w:rPr>
+          <w:rFonts w:ascii="Consolas" w:cs="Consolas" w:eastAsia="Consolas" w:hAnsi="Consolas"/>
+          <w:sz w:val="20"/>
+          <w:szCs w:val="20"/>
+        </w:rPr>
+        <w:br/>
+        <w:t xml:space="preserve">gcse revision app</w:t>
+      </w:r>
+      <w:r>
+        <w:rPr>
+          <w:rFonts w:ascii="Consolas" w:cs="Consolas" w:eastAsia="Consolas" w:hAnsi="Consolas"/>
+          <w:sz w:val="20"/>
+          <w:szCs w:val="20"/>
+        </w:rPr>
+        <w:br/>
+        <w:t xml:space="preserve">a level revision</w:t>
+      </w:r>
+      <w:r>
+        <w:rPr>
+          <w:rFonts w:ascii="Consolas" w:cs="Consolas" w:eastAsia="Consolas" w:hAnsi="Consolas"/>
+          <w:sz w:val="20"/>
+          <w:szCs w:val="20"/>
+        </w:rPr>
+        <w:br/>
+        <w:t xml:space="preserve">ai tutor gcse</w:t>
+      </w:r>
+      <w:r>
+        <w:rPr>
+          <w:rFonts w:ascii="Consolas" w:cs="Consolas" w:eastAsia="Consolas" w:hAnsi="Consolas"/>
+          <w:sz w:val="20"/>
+          <w:szCs w:val="20"/>
+        </w:rPr>
+        <w:br/>
+        <w:t xml:space="preserve">past papers online</w:t>
+      </w:r>
+      <w:r>
+        <w:rPr>
+          <w:rFonts w:ascii="Consolas" w:cs="Consolas" w:eastAsia="Consolas" w:hAnsi="Consolas"/>
+          <w:sz w:val="20"/>
+          <w:szCs w:val="20"/>
+        </w:rPr>
+        <w:br/>
+        <w:t xml:space="preserve">revision timetable maker</w:t>
+      </w:r>
+      <w:r>
+        <w:rPr>
+          <w:rFonts w:ascii="Consolas" w:cs="Consolas" w:eastAsia="Consolas" w:hAnsi="Consolas"/>
+          <w:sz w:val="20"/>
+          <w:szCs w:val="20"/>
+        </w:rPr>
+        <w:br/>
+        <w:t xml:space="preserve">mark my essay ai</w:t>
+      </w:r>
+      <w:r>
+        <w:rPr>
+          <w:rFonts w:ascii="Consolas" w:cs="Consolas" w:eastAsia="Consolas" w:hAnsi="Consolas"/>
+          <w:sz w:val="20"/>
+          <w:szCs w:val="20"/>
+        </w:rPr>
+        <w:br/>
+        <w:t xml:space="preserve">flashcard maker</w:t>
+      </w:r>
+      <w:r>
+        <w:rPr>
+          <w:rFonts w:ascii="Consolas" w:cs="Consolas" w:eastAsia="Consolas" w:hAnsi="Consolas"/>
+          <w:sz w:val="20"/>
+          <w:szCs w:val="20"/>
+        </w:rPr>
+        <w:br/>
+        <w:t xml:space="preserve">study plan maker</w:t>
+      </w:r>
+      <w:r>
+        <w:rPr>
+          <w:rFonts w:ascii="Consolas" w:cs="Consolas" w:eastAsia="Consolas" w:hAnsi="Consolas"/>
+          <w:sz w:val="20"/>
+          <w:szCs w:val="20"/>
+        </w:rPr>
+        <w:br/>
+        <w:t xml:space="preserve">gcse maths revision</w:t>
+      </w:r>
+    </w:p>
+    <w:p>
+      <w:pPr>
+        <w:spacing w:after="40" w:before="140"/>
+      </w:pPr>
+      <w:r>
+        <w:rPr>
+          <w:b/>
+          <w:bCs/>
+          <w:color w:val="0B1B33"/>
+          <w:sz w:val="21"/>
+          <w:szCs w:val="21"/>
+        </w:rPr>
+        <w:t xml:space="preserve">Sitelinks (link text → URL)</w:t>
+      </w:r>
+    </w:p>
+    <w:p>
+      <w:pPr>
+        <w:pBdr>
+          <w:top w:val="single" w:color="C7D2E4" w:sz="6" w:space="8"/>
+          <w:bottom w:val="single" w:color="C7D2E4" w:sz="6" w:space="8"/>
+          <w:left w:val="single" w:color="2E6BC4" w:sz="18" w:space="8"/>
+          <w:right w:val="single" w:color="C7D2E4" w:sz="6" w:space="8"/>
+        </w:pBdr>
+        <w:shd w:fill="F3F6FB" w:val="clear"/>
+        <w:spacing w:after="140" w:before="60"/>
+        <w:ind w:left="120" w:right="120"/>
+      </w:pPr>
+      <w:r>
+        <w:rPr>
+          <w:rFonts w:ascii="Consolas" w:cs="Consolas" w:eastAsia="Consolas" w:hAnsi="Consolas"/>
+          <w:sz w:val="20"/>
+          <w:szCs w:val="20"/>
+        </w:rPr>
+        <w:t xml:space="preserve">Free Predicted Grade  →  studyear.com/free</w:t>
+      </w:r>
+      <w:r>
+        <w:rPr>
+          <w:rFonts w:ascii="Consolas" w:cs="Consolas" w:eastAsia="Consolas" w:hAnsi="Consolas"/>
+          <w:sz w:val="20"/>
+          <w:szCs w:val="20"/>
+        </w:rPr>
+        <w:br/>
+        <w:t xml:space="preserve">Meet the AI Tutor     →  studyear.com/study/#tutor</w:t>
+      </w:r>
+      <w:r>
+        <w:rPr>
+          <w:rFonts w:ascii="Consolas" w:cs="Consolas" w:eastAsia="Consolas" w:hAnsi="Consolas"/>
+          <w:sz w:val="20"/>
+          <w:szCs w:val="20"/>
+        </w:rPr>
+        <w:br/>
+        <w:t xml:space="preserve">Past Papers           →  studyear.com/study/#papers</w:t>
+      </w:r>
+      <w:r>
+        <w:rPr>
+          <w:rFonts w:ascii="Consolas" w:cs="Consolas" w:eastAsia="Consolas" w:hAnsi="Consolas"/>
+          <w:sz w:val="20"/>
+          <w:szCs w:val="20"/>
+        </w:rPr>
+        <w:br/>
+        <w:t xml:space="preserve">How It Works          →  studyear.com/how-it-works</w:t>
+      </w:r>
+    </w:p>
+    <w:p>
+      <w:pPr>
+        <w:spacing w:after="40" w:before="140"/>
+      </w:pPr>
+      <w:r>
+        <w:rPr>
+          <w:b/>
+          <w:bCs/>
+          <w:color w:val="0B1B33"/>
+          <w:sz w:val="21"/>
+          <w:szCs w:val="21"/>
+        </w:rPr>
+        <w:t xml:space="preserve">Callout extensions</w:t>
+      </w:r>
+    </w:p>
+    <w:p>
+      <w:pPr>
+        <w:pBdr>
+          <w:top w:val="single" w:color="C7D2E4" w:sz="6" w:space="8"/>
+          <w:bottom w:val="single" w:color="C7D2E4" w:sz="6" w:space="8"/>
+          <w:left w:val="single" w:color="2E6BC4" w:sz="18" w:space="8"/>
+          <w:right w:val="single" w:color="C7D2E4" w:sz="6" w:space="8"/>
+        </w:pBdr>
+        <w:shd w:fill="F3F6FB" w:val="clear"/>
+        <w:spacing w:after="140" w:before="60"/>
+        <w:ind w:left="120" w:right="120"/>
+      </w:pPr>
+      <w:r>
+        <w:rPr>
+          <w:rFonts w:ascii="Consolas" w:cs="Consolas" w:eastAsia="Consolas" w:hAnsi="Consolas"/>
+          <w:sz w:val="20"/>
+          <w:szCs w:val="20"/>
+        </w:rPr>
+        <w:t xml:space="preserve">Free to start</w:t>
+      </w:r>
+      <w:r>
+        <w:rPr>
+          <w:rFonts w:ascii="Consolas" w:cs="Consolas" w:eastAsia="Consolas" w:hAnsi="Consolas"/>
+          <w:sz w:val="20"/>
+          <w:szCs w:val="20"/>
+        </w:rPr>
+        <w:br/>
+        <w:t xml:space="preserve">No sign-up</w:t>
+      </w:r>
+      <w:r>
+        <w:rPr>
+          <w:rFonts w:ascii="Consolas" w:cs="Consolas" w:eastAsia="Consolas" w:hAnsi="Consolas"/>
+          <w:sz w:val="20"/>
+          <w:szCs w:val="20"/>
+        </w:rPr>
+        <w:br/>
+        <w:t xml:space="preserve">GCSE &amp; A-Level</w:t>
+      </w:r>
+      <w:r>
+        <w:rPr>
+          <w:rFonts w:ascii="Consolas" w:cs="Consolas" w:eastAsia="Consolas" w:hAnsi="Consolas"/>
+          <w:sz w:val="20"/>
+          <w:szCs w:val="20"/>
+        </w:rPr>
+        <w:br/>
+        <w:t xml:space="preserve">Built for UK exams</w:t>
+      </w:r>
+      <w:r>
+        <w:rPr>
+          <w:rFonts w:ascii="Consolas" w:cs="Consolas" w:eastAsia="Consolas" w:hAnsi="Consolas"/>
+          <w:sz w:val="20"/>
+          <w:szCs w:val="20"/>
+        </w:rPr>
+        <w:br/>
+        <w:t xml:space="preserve">Works offline</w:t>
+      </w:r>
+    </w:p>
+    <w:p>
+      <w:pPr>
+        <w:pStyle w:val="Heading2"/>
+      </w:pPr>
+      <w:r>
+        <w:t xml:space="preserve">YouTube / Reels video scripts</w:t>
+      </w:r>
+    </w:p>
+    <w:p>
+      <w:pPr>
+        <w:spacing w:after="40" w:before="140"/>
+      </w:pPr>
+      <w:r>
+        <w:rPr>
+          <w:b/>
+          <w:bCs/>
+          <w:color w:val="0B1B33"/>
+          <w:sz w:val="21"/>
+          <w:szCs w:val="21"/>
+        </w:rPr>
+        <w:t xml:space="preserve">6-second bumper</w:t>
+      </w:r>
+    </w:p>
+    <w:p>
+      <w:pPr>
+        <w:pBdr>
+          <w:top w:val="single" w:color="C7D2E4" w:sz="6" w:space="8"/>
+          <w:bottom w:val="single" w:color="C7D2E4" w:sz="6" w:space="8"/>
+          <w:left w:val="single" w:color="2E6BC4" w:sz="18" w:space="8"/>
+          <w:right w:val="single" w:color="C7D2E4" w:sz="6" w:space="8"/>
+        </w:pBdr>
+        <w:shd w:fill="F3F6FB" w:val="clear"/>
+        <w:spacing w:after="140" w:before="60"/>
+        <w:ind w:left="120" w:right="120"/>
+      </w:pPr>
+      <w:r>
+        <w:rPr>
+          <w:rFonts w:ascii="Consolas" w:cs="Consolas" w:eastAsia="Consolas" w:hAnsi="Consolas"/>
+          <w:sz w:val="20"/>
+          <w:szCs w:val="20"/>
+        </w:rPr>
+        <w:t xml:space="preserve">[On screen: a grade dial moves 5 → 7]</w:t>
+      </w:r>
+      <w:r>
+        <w:rPr>
+          <w:rFonts w:ascii="Consolas" w:cs="Consolas" w:eastAsia="Consolas" w:hAnsi="Consolas"/>
+          <w:sz w:val="20"/>
+          <w:szCs w:val="20"/>
+        </w:rPr>
+        <w:br/>
+        <w:t xml:space="preserve">VO/Text: “Your predicted grade. Free. In 60 seconds.”</w:t>
+      </w:r>
+      <w:r>
+        <w:rPr>
+          <w:rFonts w:ascii="Consolas" w:cs="Consolas" w:eastAsia="Consolas" w:hAnsi="Consolas"/>
+          <w:sz w:val="20"/>
+          <w:szCs w:val="20"/>
+        </w:rPr>
+        <w:br/>
+        <w:t xml:space="preserve">End card: StudYear · studyear.com/free</w:t>
+      </w:r>
+    </w:p>
+    <w:p>
+      <w:pPr>
+        <w:spacing w:after="40" w:before="140"/>
+      </w:pPr>
+      <w:r>
+        <w:rPr>
+          <w:b/>
+          <w:bCs/>
+          <w:color w:val="0B1B33"/>
+          <w:sz w:val="21"/>
+          <w:szCs w:val="21"/>
+        </w:rPr>
+        <w:t xml:space="preserve">15-second</w:t>
+      </w:r>
+    </w:p>
+    <w:p>
+      <w:pPr>
+        <w:pBdr>
+          <w:top w:val="single" w:color="C7D2E4" w:sz="6" w:space="8"/>
+          <w:bottom w:val="single" w:color="C7D2E4" w:sz="6" w:space="8"/>
+          <w:left w:val="single" w:color="2E6BC4" w:sz="18" w:space="8"/>
+          <w:right w:val="single" w:color="C7D2E4" w:sz="6" w:space="8"/>
+        </w:pBdr>
+        <w:shd w:fill="F3F6FB" w:val="clear"/>
+        <w:spacing w:after="140" w:before="60"/>
+        <w:ind w:left="120" w:right="120"/>
+      </w:pPr>
+      <w:r>
+        <w:rPr>
+          <w:rFonts w:ascii="Consolas" w:cs="Consolas" w:eastAsia="Consolas" w:hAnsi="Consolas"/>
+          <w:sz w:val="20"/>
+          <w:szCs w:val="20"/>
+        </w:rPr>
+        <w:t xml:space="preserve">0–3s  “Revision that remembers what you get wrong.”</w:t>
+      </w:r>
+      <w:r>
+        <w:rPr>
+          <w:rFonts w:ascii="Consolas" w:cs="Consolas" w:eastAsia="Consolas" w:hAnsi="Consolas"/>
+          <w:sz w:val="20"/>
+          <w:szCs w:val="20"/>
+        </w:rPr>
+        <w:br/>
+        <w:t xml:space="preserve">3–9s  Show Smart Review resurfacing a weak topic + the AI tutor explaining it.</w:t>
+      </w:r>
+      <w:r>
+        <w:rPr>
+          <w:rFonts w:ascii="Consolas" w:cs="Consolas" w:eastAsia="Consolas" w:hAnsi="Consolas"/>
+          <w:sz w:val="20"/>
+          <w:szCs w:val="20"/>
+        </w:rPr>
+        <w:br/>
+        <w:t xml:space="preserve">9–13s “Free predicted grade and a plan — in 60 seconds.”</w:t>
+      </w:r>
+      <w:r>
+        <w:rPr>
+          <w:rFonts w:ascii="Consolas" w:cs="Consolas" w:eastAsia="Consolas" w:hAnsi="Consolas"/>
+          <w:sz w:val="20"/>
+          <w:szCs w:val="20"/>
+        </w:rPr>
+        <w:br/>
+        <w:t xml:space="preserve">13–15s End card: studyear.com/free</w:t>
+      </w:r>
+    </w:p>
+    <w:p>
+      <w:pPr>
+        <w:spacing w:after="40" w:before="140"/>
+      </w:pPr>
+      <w:r>
+        <w:rPr>
+          <w:b/>
+          <w:bCs/>
+          <w:color w:val="0B1B33"/>
+          <w:sz w:val="21"/>
+          <w:szCs w:val="21"/>
+        </w:rPr>
+        <w:t xml:space="preserve">30-second</w:t>
+      </w:r>
+    </w:p>
+    <w:p>
+      <w:pPr>
+        <w:pBdr>
+          <w:top w:val="single" w:color="C7D2E4" w:sz="6" w:space="8"/>
+          <w:bottom w:val="single" w:color="C7D2E4" w:sz="6" w:space="8"/>
+          <w:left w:val="single" w:color="2E6BC4" w:sz="18" w:space="8"/>
+          <w:right w:val="single" w:color="C7D2E4" w:sz="6" w:space="8"/>
+        </w:pBdr>
+        <w:shd w:fill="F3F6FB" w:val="clear"/>
+        <w:spacing w:after="140" w:before="60"/>
+        <w:ind w:left="120" w:right="120"/>
+      </w:pPr>
+      <w:r>
+        <w:rPr>
+          <w:rFonts w:ascii="Consolas" w:cs="Consolas" w:eastAsia="Consolas" w:hAnsi="Consolas"/>
+          <w:sz w:val="20"/>
+          <w:szCs w:val="20"/>
+        </w:rPr>
+        <w:t xml:space="preserve">0–4s   Hook: “Cramming doesn’t work. This does.”</w:t>
+      </w:r>
+      <w:r>
+        <w:rPr>
+          <w:rFonts w:ascii="Consolas" w:cs="Consolas" w:eastAsia="Consolas" w:hAnsi="Consolas"/>
+          <w:sz w:val="20"/>
+          <w:szCs w:val="20"/>
+        </w:rPr>
+        <w:br/>
+        <w:t xml:space="preserve">4–12s  AI tutor teaches the method (not the answer) on any topic.</w:t>
+      </w:r>
+      <w:r>
+        <w:rPr>
+          <w:rFonts w:ascii="Consolas" w:cs="Consolas" w:eastAsia="Consolas" w:hAnsi="Consolas"/>
+          <w:sz w:val="20"/>
+          <w:szCs w:val="20"/>
+        </w:rPr>
+        <w:br/>
+        <w:t xml:space="preserve">12–20s Smart Review brings weak topics back; the planner builds the week.</w:t>
+      </w:r>
+      <w:r>
+        <w:rPr>
+          <w:rFonts w:ascii="Consolas" w:cs="Consolas" w:eastAsia="Consolas" w:hAnsi="Consolas"/>
+          <w:sz w:val="20"/>
+          <w:szCs w:val="20"/>
+        </w:rPr>
+        <w:br/>
+        <w:t xml:space="preserve">20–26s Sit real past papers; watch the predicted grade move.</w:t>
+      </w:r>
+      <w:r>
+        <w:rPr>
+          <w:rFonts w:ascii="Consolas" w:cs="Consolas" w:eastAsia="Consolas" w:hAnsi="Consolas"/>
+          <w:sz w:val="20"/>
+          <w:szCs w:val="20"/>
+        </w:rPr>
+        <w:br/>
+        <w:t xml:space="preserve">26–30s “Start free — no sign-up.” End card: studyear.com/free</w:t>
+      </w:r>
+    </w:p>
+    <w:p>
+      <w:pPr>
+        <w:spacing w:after="0"/>
+      </w:pPr>
+      <w:r>
+        <w:br w:type="page"/>
+      </w:r>
+    </w:p>
+    <w:p>
+      <w:pPr>
+        <w:pStyle w:val="Heading1"/>
+      </w:pPr>
+      <w:r>
+        <w:t xml:space="preserve">10. Email nurture sequence (free sign-ups &amp; leads)</w:t>
+      </w:r>
+    </w:p>
+    <w:p>
+      <w:pPr>
+        <w:spacing w:after="120"/>
+      </w:pPr>
+      <w:r>
+        <w:rPr>
+          <w:i/>
+          <w:iCs/>
+          <w:color w:val="5B6B85"/>
+        </w:rPr>
+        <w:t xml:space="preserve">Send after someone tries the free tool or leaves an email. Feature-led, one job per email. Swap in your sender name.</w:t>
+      </w:r>
+    </w:p>
+    <w:p>
+      <w:pPr>
+        <w:spacing w:after="40" w:before="140"/>
+      </w:pPr>
+      <w:r>
+        <w:rPr>
+          <w:b/>
+          <w:bCs/>
+          <w:color w:val="0B1B33"/>
+          <w:sz w:val="21"/>
+          <w:szCs w:val="21"/>
+        </w:rPr>
+        <w:t xml:space="preserve">Email 1 (send now) — Welcome + activate</w:t>
+      </w:r>
+    </w:p>
+    <w:p>
+      <w:pPr>
+        <w:spacing w:after="60"/>
+      </w:pPr>
+      <w:r>
+        <w:rPr>
+          <w:b/>
+          <w:bCs/>
+          <w:color w:val="0B1B33"/>
+        </w:rPr>
+        <w:t xml:space="preserve">Subject: </w:t>
+      </w:r>
+      <w:r>
+        <w:t xml:space="preserve">Your study plan is ready 🎯</w:t>
+      </w:r>
+    </w:p>
+    <w:p>
+      <w:pPr>
+        <w:spacing w:after="60"/>
+      </w:pPr>
+      <w:r>
+        <w:rPr>
+          <w:b/>
+          <w:bCs/>
+          <w:color w:val="0B1B33"/>
+        </w:rPr>
+        <w:t xml:space="preserve">Preview: </w:t>
+      </w:r>
+      <w:r>
+        <w:t xml:space="preserve">Your predicted grade + first step inside.</w:t>
+      </w:r>
+    </w:p>
+    <w:p>
+      <w:pPr>
+        <w:pBdr>
+          <w:top w:val="single" w:color="C7D2E4" w:sz="6" w:space="8"/>
+          <w:bottom w:val="single" w:color="C7D2E4" w:sz="6" w:space="8"/>
+          <w:left w:val="single" w:color="2E6BC4" w:sz="18" w:space="8"/>
+          <w:right w:val="single" w:color="C7D2E4" w:sz="6" w:space="8"/>
+        </w:pBdr>
+        <w:shd w:fill="F3F6FB" w:val="clear"/>
+        <w:spacing w:after="140" w:before="60"/>
+        <w:ind w:left="120" w:right="120"/>
+      </w:pPr>
+      <w:r>
+        <w:rPr>
+          <w:rFonts w:ascii="Consolas" w:cs="Consolas" w:eastAsia="Consolas" w:hAnsi="Consolas"/>
+          <w:sz w:val="20"/>
+          <w:szCs w:val="20"/>
+        </w:rPr>
+        <w:t xml:space="preserve">Hi [first name],</w:t>
+      </w:r>
+      <w:r>
+        <w:rPr>
+          <w:rFonts w:ascii="Consolas" w:cs="Consolas" w:eastAsia="Consolas" w:hAnsi="Consolas"/>
+          <w:sz w:val="20"/>
+          <w:szCs w:val="20"/>
+        </w:rPr>
+        <w:br/>
+        <w:t xml:space="preserve"/>
+      </w:r>
+      <w:r>
+        <w:rPr>
+          <w:rFonts w:ascii="Consolas" w:cs="Consolas" w:eastAsia="Consolas" w:hAnsi="Consolas"/>
+          <w:sz w:val="20"/>
+          <w:szCs w:val="20"/>
+        </w:rPr>
+        <w:br/>
+        <w:t xml:space="preserve">Your StudYear plan is ready. You’ve got your predicted grade and a personalised, week-by-week route to move it.</w:t>
+      </w:r>
+      <w:r>
+        <w:rPr>
+          <w:rFonts w:ascii="Consolas" w:cs="Consolas" w:eastAsia="Consolas" w:hAnsi="Consolas"/>
+          <w:sz w:val="20"/>
+          <w:szCs w:val="20"/>
+        </w:rPr>
+        <w:br/>
+        <w:t xml:space="preserve"/>
+      </w:r>
+      <w:r>
+        <w:rPr>
+          <w:rFonts w:ascii="Consolas" w:cs="Consolas" w:eastAsia="Consolas" w:hAnsi="Consolas"/>
+          <w:sz w:val="20"/>
+          <w:szCs w:val="20"/>
+        </w:rPr>
+        <w:br/>
+        <w:t xml:space="preserve">Do just one thing today: a 15-minute Smart Review session. It brings back exactly what you get wrong — so it actually sticks.</w:t>
+      </w:r>
+      <w:r>
+        <w:rPr>
+          <w:rFonts w:ascii="Consolas" w:cs="Consolas" w:eastAsia="Consolas" w:hAnsi="Consolas"/>
+          <w:sz w:val="20"/>
+          <w:szCs w:val="20"/>
+        </w:rPr>
+        <w:br/>
+        <w:t xml:space="preserve"/>
+      </w:r>
+      <w:r>
+        <w:rPr>
+          <w:rFonts w:ascii="Consolas" w:cs="Consolas" w:eastAsia="Consolas" w:hAnsi="Consolas"/>
+          <w:sz w:val="20"/>
+          <w:szCs w:val="20"/>
+        </w:rPr>
+        <w:br/>
+        <w:t xml:space="preserve">See your plan → studyear.com/free</w:t>
+      </w:r>
+    </w:p>
+    <w:p>
+      <w:pPr>
+        <w:spacing w:after="60"/>
+      </w:pPr>
+      <w:r>
+        <w:rPr>
+          <w:b/>
+          <w:bCs/>
+          <w:color w:val="0B1B33"/>
+        </w:rPr>
+        <w:t xml:space="preserve">CTA button: </w:t>
+      </w:r>
+      <w:r>
+        <w:t xml:space="preserve">Open my plan</w:t>
+      </w:r>
+    </w:p>
+    <w:p>
+      <w:pPr>
+        <w:spacing w:after="40" w:before="140"/>
+      </w:pPr>
+      <w:r>
+        <w:rPr>
+          <w:b/>
+          <w:bCs/>
+          <w:color w:val="0B1B33"/>
+          <w:sz w:val="21"/>
+          <w:szCs w:val="21"/>
+        </w:rPr>
+        <w:t xml:space="preserve">Email 2 (day 2) — AI Tutor</w:t>
+      </w:r>
+    </w:p>
+    <w:p>
+      <w:pPr>
+        <w:spacing w:after="60"/>
+      </w:pPr>
+      <w:r>
+        <w:rPr>
+          <w:b/>
+          <w:bCs/>
+          <w:color w:val="0B1B33"/>
+        </w:rPr>
+        <w:t xml:space="preserve">Subject: </w:t>
+      </w:r>
+      <w:r>
+        <w:t xml:space="preserve">Stuck? Ask this anything 🤖</w:t>
+      </w:r>
+    </w:p>
+    <w:p>
+      <w:pPr>
+        <w:spacing w:after="60"/>
+      </w:pPr>
+      <w:r>
+        <w:rPr>
+          <w:b/>
+          <w:bCs/>
+          <w:color w:val="0B1B33"/>
+        </w:rPr>
+        <w:t xml:space="preserve">Preview: </w:t>
+      </w:r>
+      <w:r>
+        <w:t xml:space="preserve">A tutor that teaches, not tells.</w:t>
+      </w:r>
+    </w:p>
+    <w:p>
+      <w:pPr>
+        <w:pBdr>
+          <w:top w:val="single" w:color="C7D2E4" w:sz="6" w:space="8"/>
+          <w:bottom w:val="single" w:color="C7D2E4" w:sz="6" w:space="8"/>
+          <w:left w:val="single" w:color="2E6BC4" w:sz="18" w:space="8"/>
+          <w:right w:val="single" w:color="C7D2E4" w:sz="6" w:space="8"/>
+        </w:pBdr>
+        <w:shd w:fill="F3F6FB" w:val="clear"/>
+        <w:spacing w:after="140" w:before="60"/>
+        <w:ind w:left="120" w:right="120"/>
+      </w:pPr>
+      <w:r>
+        <w:rPr>
+          <w:rFonts w:ascii="Consolas" w:cs="Consolas" w:eastAsia="Consolas" w:hAnsi="Consolas"/>
+          <w:sz w:val="20"/>
+          <w:szCs w:val="20"/>
+        </w:rPr>
+        <w:t xml:space="preserve">Hi [first name],</w:t>
+      </w:r>
+      <w:r>
+        <w:rPr>
+          <w:rFonts w:ascii="Consolas" w:cs="Consolas" w:eastAsia="Consolas" w:hAnsi="Consolas"/>
+          <w:sz w:val="20"/>
+          <w:szCs w:val="20"/>
+        </w:rPr>
+        <w:br/>
+        <w:t xml:space="preserve"/>
+      </w:r>
+      <w:r>
+        <w:rPr>
+          <w:rFonts w:ascii="Consolas" w:cs="Consolas" w:eastAsia="Consolas" w:hAnsi="Consolas"/>
+          <w:sz w:val="20"/>
+          <w:szCs w:val="20"/>
+        </w:rPr>
+        <w:br/>
+        <w:t xml:space="preserve">Meet your AI tutor. Ask it anything — any subject, any time — and it explains at your pace and teaches the method, so you can do it yourself next time.</w:t>
+      </w:r>
+      <w:r>
+        <w:rPr>
+          <w:rFonts w:ascii="Consolas" w:cs="Consolas" w:eastAsia="Consolas" w:hAnsi="Consolas"/>
+          <w:sz w:val="20"/>
+          <w:szCs w:val="20"/>
+        </w:rPr>
+        <w:br/>
+        <w:t xml:space="preserve"/>
+      </w:r>
+      <w:r>
+        <w:rPr>
+          <w:rFonts w:ascii="Consolas" w:cs="Consolas" w:eastAsia="Consolas" w:hAnsi="Consolas"/>
+          <w:sz w:val="20"/>
+          <w:szCs w:val="20"/>
+        </w:rPr>
+        <w:br/>
+        <w:t xml:space="preserve">Try it now → studyear.com/study/#tutor</w:t>
+      </w:r>
+    </w:p>
+    <w:p>
+      <w:pPr>
+        <w:spacing w:after="60"/>
+      </w:pPr>
+      <w:r>
+        <w:rPr>
+          <w:b/>
+          <w:bCs/>
+          <w:color w:val="0B1B33"/>
+        </w:rPr>
+        <w:t xml:space="preserve">CTA button: </w:t>
+      </w:r>
+      <w:r>
+        <w:t xml:space="preserve">Ask the tutor</w:t>
+      </w:r>
+    </w:p>
+    <w:p>
+      <w:pPr>
+        <w:spacing w:after="40" w:before="140"/>
+      </w:pPr>
+      <w:r>
+        <w:rPr>
+          <w:b/>
+          <w:bCs/>
+          <w:color w:val="0B1B33"/>
+          <w:sz w:val="21"/>
+          <w:szCs w:val="21"/>
+        </w:rPr>
+        <w:t xml:space="preserve">Email 3 (day 4) — Smart Review</w:t>
+      </w:r>
+    </w:p>
+    <w:p>
+      <w:pPr>
+        <w:spacing w:after="60"/>
+      </w:pPr>
+      <w:r>
+        <w:rPr>
+          <w:b/>
+          <w:bCs/>
+          <w:color w:val="0B1B33"/>
+        </w:rPr>
+        <w:t xml:space="preserve">Subject: </w:t>
+      </w:r>
+      <w:r>
+        <w:t xml:space="preserve">The revision trick that beats cramming</w:t>
+      </w:r>
+    </w:p>
+    <w:p>
+      <w:pPr>
+        <w:spacing w:after="60"/>
+      </w:pPr>
+      <w:r>
+        <w:rPr>
+          <w:b/>
+          <w:bCs/>
+          <w:color w:val="0B1B33"/>
+        </w:rPr>
+        <w:t xml:space="preserve">Preview: </w:t>
+      </w:r>
+      <w:r>
+        <w:t xml:space="preserve">Why 15 focused minutes win.</w:t>
+      </w:r>
+    </w:p>
+    <w:p>
+      <w:pPr>
+        <w:pBdr>
+          <w:top w:val="single" w:color="C7D2E4" w:sz="6" w:space="8"/>
+          <w:bottom w:val="single" w:color="C7D2E4" w:sz="6" w:space="8"/>
+          <w:left w:val="single" w:color="2E6BC4" w:sz="18" w:space="8"/>
+          <w:right w:val="single" w:color="C7D2E4" w:sz="6" w:space="8"/>
+        </w:pBdr>
+        <w:shd w:fill="F3F6FB" w:val="clear"/>
+        <w:spacing w:after="140" w:before="60"/>
+        <w:ind w:left="120" w:right="120"/>
+      </w:pPr>
+      <w:r>
+        <w:rPr>
+          <w:rFonts w:ascii="Consolas" w:cs="Consolas" w:eastAsia="Consolas" w:hAnsi="Consolas"/>
+          <w:sz w:val="20"/>
+          <w:szCs w:val="20"/>
+        </w:rPr>
+        <w:t xml:space="preserve">Hi [first name],</w:t>
+      </w:r>
+      <w:r>
+        <w:rPr>
+          <w:rFonts w:ascii="Consolas" w:cs="Consolas" w:eastAsia="Consolas" w:hAnsi="Consolas"/>
+          <w:sz w:val="20"/>
+          <w:szCs w:val="20"/>
+        </w:rPr>
+        <w:br/>
+        <w:t xml:space="preserve"/>
+      </w:r>
+      <w:r>
+        <w:rPr>
+          <w:rFonts w:ascii="Consolas" w:cs="Consolas" w:eastAsia="Consolas" w:hAnsi="Consolas"/>
+          <w:sz w:val="20"/>
+          <w:szCs w:val="20"/>
+        </w:rPr>
+        <w:br/>
+        <w:t xml:space="preserve">Re-reading feels productive but fades fast. StudYear’s Smart Review resurfaces your weak topics at the perfect moment — so short, spaced sessions beat marathon cramming every time.</w:t>
+      </w:r>
+      <w:r>
+        <w:rPr>
+          <w:rFonts w:ascii="Consolas" w:cs="Consolas" w:eastAsia="Consolas" w:hAnsi="Consolas"/>
+          <w:sz w:val="20"/>
+          <w:szCs w:val="20"/>
+        </w:rPr>
+        <w:br/>
+        <w:t xml:space="preserve"/>
+      </w:r>
+      <w:r>
+        <w:rPr>
+          <w:rFonts w:ascii="Consolas" w:cs="Consolas" w:eastAsia="Consolas" w:hAnsi="Consolas"/>
+          <w:sz w:val="20"/>
+          <w:szCs w:val="20"/>
+        </w:rPr>
+        <w:br/>
+        <w:t xml:space="preserve">Do today’s review → studyear.com/study/#smartreview</w:t>
+      </w:r>
+    </w:p>
+    <w:p>
+      <w:pPr>
+        <w:spacing w:after="60"/>
+      </w:pPr>
+      <w:r>
+        <w:rPr>
+          <w:b/>
+          <w:bCs/>
+          <w:color w:val="0B1B33"/>
+        </w:rPr>
+        <w:t xml:space="preserve">CTA button: </w:t>
+      </w:r>
+      <w:r>
+        <w:t xml:space="preserve">Start today’s review</w:t>
+      </w:r>
+    </w:p>
+    <w:p>
+      <w:pPr>
+        <w:spacing w:after="40" w:before="140"/>
+      </w:pPr>
+      <w:r>
+        <w:rPr>
+          <w:b/>
+          <w:bCs/>
+          <w:color w:val="0B1B33"/>
+          <w:sz w:val="21"/>
+          <w:szCs w:val="21"/>
+        </w:rPr>
+        <w:t xml:space="preserve">Email 4 (day 7) — Exam practice + predicted grade</w:t>
+      </w:r>
+    </w:p>
+    <w:p>
+      <w:pPr>
+        <w:spacing w:after="60"/>
+      </w:pPr>
+      <w:r>
+        <w:rPr>
+          <w:b/>
+          <w:bCs/>
+          <w:color w:val="0B1B33"/>
+        </w:rPr>
+        <w:t xml:space="preserve">Subject: </w:t>
+      </w:r>
+      <w:r>
+        <w:t xml:space="preserve">Sit the exam before the exam</w:t>
+      </w:r>
+    </w:p>
+    <w:p>
+      <w:pPr>
+        <w:spacing w:after="60"/>
+      </w:pPr>
+      <w:r>
+        <w:rPr>
+          <w:b/>
+          <w:bCs/>
+          <w:color w:val="0B1B33"/>
+        </w:rPr>
+        <w:t xml:space="preserve">Preview: </w:t>
+      </w:r>
+      <w:r>
+        <w:t xml:space="preserve">Real papers. Real feedback.</w:t>
+      </w:r>
+    </w:p>
+    <w:p>
+      <w:pPr>
+        <w:pBdr>
+          <w:top w:val="single" w:color="C7D2E4" w:sz="6" w:space="8"/>
+          <w:bottom w:val="single" w:color="C7D2E4" w:sz="6" w:space="8"/>
+          <w:left w:val="single" w:color="2E6BC4" w:sz="18" w:space="8"/>
+          <w:right w:val="single" w:color="C7D2E4" w:sz="6" w:space="8"/>
+        </w:pBdr>
+        <w:shd w:fill="F3F6FB" w:val="clear"/>
+        <w:spacing w:after="140" w:before="60"/>
+        <w:ind w:left="120" w:right="120"/>
+      </w:pPr>
+      <w:r>
+        <w:rPr>
+          <w:rFonts w:ascii="Consolas" w:cs="Consolas" w:eastAsia="Consolas" w:hAnsi="Consolas"/>
+          <w:sz w:val="20"/>
+          <w:szCs w:val="20"/>
+        </w:rPr>
+        <w:t xml:space="preserve">Hi [first name],</w:t>
+      </w:r>
+      <w:r>
+        <w:rPr>
+          <w:rFonts w:ascii="Consolas" w:cs="Consolas" w:eastAsia="Consolas" w:hAnsi="Consolas"/>
+          <w:sz w:val="20"/>
+          <w:szCs w:val="20"/>
+        </w:rPr>
+        <w:br/>
+        <w:t xml:space="preserve"/>
+      </w:r>
+      <w:r>
+        <w:rPr>
+          <w:rFonts w:ascii="Consolas" w:cs="Consolas" w:eastAsia="Consolas" w:hAnsi="Consolas"/>
+          <w:sz w:val="20"/>
+          <w:szCs w:val="20"/>
+        </w:rPr>
+        <w:br/>
+        <w:t xml:space="preserve">Confidence comes from rehearsal. Sit timed past papers by exam board, get mark-scheme feedback, and watch your predicted grade move as you improve.</w:t>
+      </w:r>
+      <w:r>
+        <w:rPr>
+          <w:rFonts w:ascii="Consolas" w:cs="Consolas" w:eastAsia="Consolas" w:hAnsi="Consolas"/>
+          <w:sz w:val="20"/>
+          <w:szCs w:val="20"/>
+        </w:rPr>
+        <w:br/>
+        <w:t xml:space="preserve"/>
+      </w:r>
+      <w:r>
+        <w:rPr>
+          <w:rFonts w:ascii="Consolas" w:cs="Consolas" w:eastAsia="Consolas" w:hAnsi="Consolas"/>
+          <w:sz w:val="20"/>
+          <w:szCs w:val="20"/>
+        </w:rPr>
+        <w:br/>
+        <w:t xml:space="preserve">Practise now → studyear.com/study/#papers</w:t>
+      </w:r>
+    </w:p>
+    <w:p>
+      <w:pPr>
+        <w:spacing w:after="60"/>
+      </w:pPr>
+      <w:r>
+        <w:rPr>
+          <w:b/>
+          <w:bCs/>
+          <w:color w:val="0B1B33"/>
+        </w:rPr>
+        <w:t xml:space="preserve">CTA button: </w:t>
+      </w:r>
+      <w:r>
+        <w:t xml:space="preserve">Try a past paper</w:t>
+      </w:r>
+    </w:p>
+    <w:p>
+      <w:pPr>
+        <w:spacing w:after="40" w:before="140"/>
+      </w:pPr>
+      <w:r>
+        <w:rPr>
+          <w:b/>
+          <w:bCs/>
+          <w:color w:val="0B1B33"/>
+          <w:sz w:val="21"/>
+          <w:szCs w:val="21"/>
+        </w:rPr>
+        <w:t xml:space="preserve">Email 5 (day 10) — Keep going / soft upgrade</w:t>
+      </w:r>
+    </w:p>
+    <w:p>
+      <w:pPr>
+        <w:spacing w:after="60"/>
+      </w:pPr>
+      <w:r>
+        <w:rPr>
+          <w:b/>
+          <w:bCs/>
+          <w:color w:val="0B1B33"/>
+        </w:rPr>
+        <w:t xml:space="preserve">Subject: </w:t>
+      </w:r>
+      <w:r>
+        <w:t xml:space="preserve">You’re building momentum 🔥</w:t>
+      </w:r>
+    </w:p>
+    <w:p>
+      <w:pPr>
+        <w:spacing w:after="60"/>
+      </w:pPr>
+      <w:r>
+        <w:rPr>
+          <w:b/>
+          <w:bCs/>
+          <w:color w:val="0B1B33"/>
+        </w:rPr>
+        <w:t xml:space="preserve">Preview: </w:t>
+      </w:r>
+      <w:r>
+        <w:t xml:space="preserve">Keep the streak alive.</w:t>
+      </w:r>
+    </w:p>
+    <w:p>
+      <w:pPr>
+        <w:pBdr>
+          <w:top w:val="single" w:color="C7D2E4" w:sz="6" w:space="8"/>
+          <w:bottom w:val="single" w:color="C7D2E4" w:sz="6" w:space="8"/>
+          <w:left w:val="single" w:color="2E6BC4" w:sz="18" w:space="8"/>
+          <w:right w:val="single" w:color="C7D2E4" w:sz="6" w:space="8"/>
+        </w:pBdr>
+        <w:shd w:fill="F3F6FB" w:val="clear"/>
+        <w:spacing w:after="140" w:before="60"/>
+        <w:ind w:left="120" w:right="120"/>
+      </w:pPr>
+      <w:r>
+        <w:rPr>
+          <w:rFonts w:ascii="Consolas" w:cs="Consolas" w:eastAsia="Consolas" w:hAnsi="Consolas"/>
+          <w:sz w:val="20"/>
+          <w:szCs w:val="20"/>
+        </w:rPr>
+        <w:t xml:space="preserve">Hi [first name],</w:t>
+      </w:r>
+      <w:r>
+        <w:rPr>
+          <w:rFonts w:ascii="Consolas" w:cs="Consolas" w:eastAsia="Consolas" w:hAnsi="Consolas"/>
+          <w:sz w:val="20"/>
+          <w:szCs w:val="20"/>
+        </w:rPr>
+        <w:br/>
+        <w:t xml:space="preserve"/>
+      </w:r>
+      <w:r>
+        <w:rPr>
+          <w:rFonts w:ascii="Consolas" w:cs="Consolas" w:eastAsia="Consolas" w:hAnsi="Consolas"/>
+          <w:sz w:val="20"/>
+          <w:szCs w:val="20"/>
+        </w:rPr>
+        <w:br/>
+        <w:t xml:space="preserve">You’ve made a strong start. Keep the streak going — your plan adapts as you go, and everything you need is in one place.</w:t>
+      </w:r>
+      <w:r>
+        <w:rPr>
+          <w:rFonts w:ascii="Consolas" w:cs="Consolas" w:eastAsia="Consolas" w:hAnsi="Consolas"/>
+          <w:sz w:val="20"/>
+          <w:szCs w:val="20"/>
+        </w:rPr>
+        <w:br/>
+        <w:t xml:space="preserve"/>
+      </w:r>
+      <w:r>
+        <w:rPr>
+          <w:rFonts w:ascii="Consolas" w:cs="Consolas" w:eastAsia="Consolas" w:hAnsi="Consolas"/>
+          <w:sz w:val="20"/>
+          <w:szCs w:val="20"/>
+        </w:rPr>
+        <w:br/>
+        <w:t xml:space="preserve">When you’re ready for more AI power (unlimited tutoring, essay marking, full courses), you can top up any time. No pressure — the free tier keeps working.</w:t>
+      </w:r>
+      <w:r>
+        <w:rPr>
+          <w:rFonts w:ascii="Consolas" w:cs="Consolas" w:eastAsia="Consolas" w:hAnsi="Consolas"/>
+          <w:sz w:val="20"/>
+          <w:szCs w:val="20"/>
+        </w:rPr>
+        <w:br/>
+        <w:t xml:space="preserve"/>
+      </w:r>
+      <w:r>
+        <w:rPr>
+          <w:rFonts w:ascii="Consolas" w:cs="Consolas" w:eastAsia="Consolas" w:hAnsi="Consolas"/>
+          <w:sz w:val="20"/>
+          <w:szCs w:val="20"/>
+        </w:rPr>
+        <w:br/>
+        <w:t xml:space="preserve">Continue → studyear.com/free</w:t>
+      </w:r>
+    </w:p>
+    <w:p>
+      <w:pPr>
+        <w:spacing w:after="60"/>
+      </w:pPr>
+      <w:r>
+        <w:rPr>
+          <w:b/>
+          <w:bCs/>
+          <w:color w:val="0B1B33"/>
+        </w:rPr>
+        <w:t xml:space="preserve">CTA button: </w:t>
+      </w:r>
+      <w:r>
+        <w:t xml:space="preserve">Keep learning</w:t>
+      </w:r>
+    </w:p>
+    <w:p>
+      <w:pPr>
+        <w:spacing w:after="0"/>
+      </w:pPr>
+      <w:r>
+        <w:br w:type="page"/>
+      </w:r>
+    </w:p>
+    <w:p>
+      <w:pPr>
+        <w:pStyle w:val="Heading1"/>
+      </w:pPr>
+      <w:r>
+        <w:t xml:space="preserve">11. marketwaros.com switch-over pack</w:t>
+      </w:r>
+    </w:p>
+    <w:p>
+      <w:pPr>
+        <w:spacing w:after="120"/>
+      </w:pPr>
+      <w:r>
+        <w:rPr>
+          <w:color w:val="1B2A44"/>
+          <w:sz w:val="20"/>
+          <w:szCs w:val="20"/>
+        </w:rPr>
+        <w:t xml:space="preserve">When you shift the marketing focus to </w:t>
+      </w:r>
+      <w:r>
+        <w:rPr>
+          <w:b/>
+          <w:bCs/>
+          <w:color w:val="0B1B33"/>
+          <w:sz w:val="20"/>
+          <w:szCs w:val="20"/>
+        </w:rPr>
+        <w:t xml:space="preserve">marketwaros.com</w:t>
+      </w:r>
+      <w:r>
+        <w:rPr>
+          <w:color w:val="1B2A44"/>
+          <w:sz w:val="20"/>
+          <w:szCs w:val="20"/>
+        </w:rPr>
+        <w:t xml:space="preserve">, you don’t start from zero — you reuse everything above. Here’s the switch-over.</w:t>
+      </w:r>
+    </w:p>
+    <w:p>
+      <w:pPr>
+        <w:spacing w:after="40" w:before="140"/>
+      </w:pPr>
+      <w:r>
+        <w:rPr>
+          <w:b/>
+          <w:bCs/>
+          <w:color w:val="0B1B33"/>
+          <w:sz w:val="21"/>
+          <w:szCs w:val="21"/>
+        </w:rPr>
+        <w:t xml:space="preserve">What to change (that’s it)</w:t>
+      </w:r>
+    </w:p>
+    <w:p>
+      <w:pPr>
+        <w:pStyle w:val="ListParagraph"/>
+        <w:numPr>
+          <w:ilvl w:val="0"/>
+          <w:numId w:val="2"/>
+        </w:numPr>
+        <w:spacing w:after="60"/>
+      </w:pPr>
+      <w:r>
+        <w:rPr>
+          <w:b/>
+          <w:bCs/>
+          <w:color w:val="0B1B33"/>
+          <w:sz w:val="20"/>
+          <w:szCs w:val="20"/>
+        </w:rPr>
+        <w:t xml:space="preserve">Destination URL → </w:t>
+      </w:r>
+      <w:r>
+        <w:rPr>
+          <w:color w:val="1B2A44"/>
+          <w:sz w:val="20"/>
+          <w:szCs w:val="20"/>
+        </w:rPr>
+        <w:t xml:space="preserve">https://www.marketwaros.com  (final CTA line + Website URL field)</w:t>
+      </w:r>
+    </w:p>
+    <w:p>
+      <w:pPr>
+        <w:pStyle w:val="ListParagraph"/>
+        <w:numPr>
+          <w:ilvl w:val="0"/>
+          <w:numId w:val="2"/>
+        </w:numPr>
+        <w:spacing w:after="60"/>
+      </w:pPr>
+      <w:r>
+        <w:rPr>
+          <w:b/>
+          <w:bCs/>
+          <w:color w:val="0B1B33"/>
+          <w:sz w:val="20"/>
+          <w:szCs w:val="20"/>
+        </w:rPr>
+        <w:t xml:space="preserve">UTM campaign → </w:t>
+      </w:r>
+      <w:r>
+        <w:rPr>
+          <w:color w:val="1B2A44"/>
+          <w:sz w:val="20"/>
+          <w:szCs w:val="20"/>
+        </w:rPr>
+        <w:t xml:space="preserve">utm_source=facebook&amp;utm_medium=paid_social&amp;utm_campaign=marketwaros_launch&amp;utm_content={{ad.name}}</w:t>
+      </w:r>
+    </w:p>
+    <w:p>
+      <w:pPr>
+        <w:pStyle w:val="ListParagraph"/>
+        <w:numPr>
+          <w:ilvl w:val="0"/>
+          <w:numId w:val="2"/>
+        </w:numPr>
+        <w:spacing w:after="60"/>
+      </w:pPr>
+      <w:r>
+        <w:rPr>
+          <w:b/>
+          <w:bCs/>
+          <w:color w:val="0B1B33"/>
+          <w:sz w:val="20"/>
+          <w:szCs w:val="20"/>
+        </w:rPr>
+        <w:t xml:space="preserve">Message match → </w:t>
+      </w:r>
+      <w:r>
+        <w:rPr>
+          <w:color w:val="1B2A44"/>
+          <w:sz w:val="20"/>
+          <w:szCs w:val="20"/>
+        </w:rPr>
+        <w:t xml:space="preserve">the ad’s promise must match what marketwaros.com actually shows on arrival (headline + offer).</w:t>
+      </w:r>
+    </w:p>
+    <w:p>
+      <w:pPr>
+        <w:pStyle w:val="ListParagraph"/>
+        <w:numPr>
+          <w:ilvl w:val="0"/>
+          <w:numId w:val="2"/>
+        </w:numPr>
+        <w:spacing w:after="60"/>
+      </w:pPr>
+      <w:r>
+        <w:rPr>
+          <w:b/>
+          <w:bCs/>
+          <w:color w:val="0B1B33"/>
+          <w:sz w:val="20"/>
+          <w:szCs w:val="20"/>
+        </w:rPr>
+        <w:t xml:space="preserve">Retarget first → </w:t>
+      </w:r>
+      <w:r>
+        <w:rPr>
+          <w:color w:val="1B2A44"/>
+          <w:sz w:val="20"/>
+          <w:szCs w:val="20"/>
+        </w:rPr>
+        <w:t xml:space="preserve">launch to the Custom Audience of studyear.com visitors + the 1% Lookalike you built. Warm audiences convert cheapest.</w:t>
+      </w:r>
+    </w:p>
+    <w:p>
+      <w:pPr>
+        <w:spacing w:after="120"/>
+      </w:pPr>
+      <w:r>
+        <w:rPr>
+          <w:b/>
+          <w:bCs/>
+          <w:color w:val="B00020"/>
+        </w:rPr>
+        <w:t xml:space="preserve">Note: </w:t>
+      </w:r>
+      <w:r>
+        <w:rPr>
+          <w:color w:val="1B2A44"/>
+          <w:sz w:val="20"/>
+          <w:szCs w:val="20"/>
+        </w:rPr>
+        <w:t xml:space="preserve">the ad copy below is a template — fill the [brackets] with marketwaros.com’s real offer/benefit (I couldn’t access the site to write it precisely). Keep it as punchy as the StudYear ads.</w:t>
+      </w:r>
+    </w:p>
+    <w:p>
+      <w:pPr>
+        <w:spacing w:after="40" w:before="140"/>
+      </w:pPr>
+      <w:r>
+        <w:rPr>
+          <w:b/>
+          <w:bCs/>
+          <w:color w:val="0B1B33"/>
+          <w:sz w:val="21"/>
+          <w:szCs w:val="21"/>
+        </w:rPr>
+        <w:t xml:space="preserve">Template ad — Variant 1</w:t>
+      </w:r>
+    </w:p>
+    <w:p>
+      <w:pPr>
+        <w:pBdr>
+          <w:top w:val="single" w:color="C7D2E4" w:sz="6" w:space="8"/>
+          <w:bottom w:val="single" w:color="C7D2E4" w:sz="6" w:space="8"/>
+          <w:left w:val="single" w:color="2E6BC4" w:sz="18" w:space="8"/>
+          <w:right w:val="single" w:color="C7D2E4" w:sz="6" w:space="8"/>
+        </w:pBdr>
+        <w:shd w:fill="F3F6FB" w:val="clear"/>
+        <w:spacing w:after="140" w:before="60"/>
+        <w:ind w:left="120" w:right="120"/>
+      </w:pPr>
+      <w:r>
+        <w:rPr>
+          <w:rFonts w:ascii="Consolas" w:cs="Consolas" w:eastAsia="Consolas" w:hAnsi="Consolas"/>
+          <w:sz w:val="20"/>
+          <w:szCs w:val="20"/>
+        </w:rPr>
+        <w:t xml:space="preserve">[One-line hook: the #1 thing marketwaros.com does for the user].</w:t>
+      </w:r>
+      <w:r>
+        <w:rPr>
+          <w:rFonts w:ascii="Consolas" w:cs="Consolas" w:eastAsia="Consolas" w:hAnsi="Consolas"/>
+          <w:sz w:val="20"/>
+          <w:szCs w:val="20"/>
+        </w:rPr>
+        <w:br/>
+        <w:t xml:space="preserve"/>
+      </w:r>
+      <w:r>
+        <w:rPr>
+          <w:rFonts w:ascii="Consolas" w:cs="Consolas" w:eastAsia="Consolas" w:hAnsi="Consolas"/>
+          <w:sz w:val="20"/>
+          <w:szCs w:val="20"/>
+        </w:rPr>
+        <w:br/>
+        <w:t xml:space="preserve">[What it is] — [the main benefit, in plain words]. [Why now / what’s new].</w:t>
+      </w:r>
+      <w:r>
+        <w:rPr>
+          <w:rFonts w:ascii="Consolas" w:cs="Consolas" w:eastAsia="Consolas" w:hAnsi="Consolas"/>
+          <w:sz w:val="20"/>
+          <w:szCs w:val="20"/>
+        </w:rPr>
+        <w:br/>
+        <w:t xml:space="preserve"/>
+      </w:r>
+      <w:r>
+        <w:rPr>
+          <w:rFonts w:ascii="Consolas" w:cs="Consolas" w:eastAsia="Consolas" w:hAnsi="Consolas"/>
+          <w:sz w:val="20"/>
+          <w:szCs w:val="20"/>
+        </w:rPr>
+        <w:br/>
+        <w:t xml:space="preserve">👉 See it: marketwaros.com</w:t>
+      </w:r>
+    </w:p>
+    <w:p>
+      <w:pPr>
+        <w:spacing w:after="40" w:before="140"/>
+      </w:pPr>
+      <w:r>
+        <w:rPr>
+          <w:b/>
+          <w:bCs/>
+          <w:color w:val="0B1B33"/>
+          <w:sz w:val="21"/>
+          <w:szCs w:val="21"/>
+        </w:rPr>
+        <w:t xml:space="preserve">Template ad — Variant 2</w:t>
+      </w:r>
+    </w:p>
+    <w:p>
+      <w:pPr>
+        <w:pBdr>
+          <w:top w:val="single" w:color="C7D2E4" w:sz="6" w:space="8"/>
+          <w:bottom w:val="single" w:color="C7D2E4" w:sz="6" w:space="8"/>
+          <w:left w:val="single" w:color="2E6BC4" w:sz="18" w:space="8"/>
+          <w:right w:val="single" w:color="C7D2E4" w:sz="6" w:space="8"/>
+        </w:pBdr>
+        <w:shd w:fill="F3F6FB" w:val="clear"/>
+        <w:spacing w:after="140" w:before="60"/>
+        <w:ind w:left="120" w:right="120"/>
+      </w:pPr>
+      <w:r>
+        <w:rPr>
+          <w:rFonts w:ascii="Consolas" w:cs="Consolas" w:eastAsia="Consolas" w:hAnsi="Consolas"/>
+          <w:sz w:val="20"/>
+          <w:szCs w:val="20"/>
+        </w:rPr>
+        <w:t xml:space="preserve">[Problem your audience feels].</w:t>
+      </w:r>
+      <w:r>
+        <w:rPr>
+          <w:rFonts w:ascii="Consolas" w:cs="Consolas" w:eastAsia="Consolas" w:hAnsi="Consolas"/>
+          <w:sz w:val="20"/>
+          <w:szCs w:val="20"/>
+        </w:rPr>
+        <w:br/>
+        <w:t xml:space="preserve"/>
+      </w:r>
+      <w:r>
+        <w:rPr>
+          <w:rFonts w:ascii="Consolas" w:cs="Consolas" w:eastAsia="Consolas" w:hAnsi="Consolas"/>
+          <w:sz w:val="20"/>
+          <w:szCs w:val="20"/>
+        </w:rPr>
+        <w:br/>
+        <w:t xml:space="preserve">marketwaros.com [solves it by …] — [proof / speed / “free to try”].</w:t>
+      </w:r>
+      <w:r>
+        <w:rPr>
+          <w:rFonts w:ascii="Consolas" w:cs="Consolas" w:eastAsia="Consolas" w:hAnsi="Consolas"/>
+          <w:sz w:val="20"/>
+          <w:szCs w:val="20"/>
+        </w:rPr>
+        <w:br/>
+        <w:t xml:space="preserve"/>
+      </w:r>
+      <w:r>
+        <w:rPr>
+          <w:rFonts w:ascii="Consolas" w:cs="Consolas" w:eastAsia="Consolas" w:hAnsi="Consolas"/>
+          <w:sz w:val="20"/>
+          <w:szCs w:val="20"/>
+        </w:rPr>
+        <w:br/>
+        <w:t xml:space="preserve">Take a look 👇</w:t>
+      </w:r>
+    </w:p>
+    <w:p>
+      <w:pPr>
+        <w:spacing w:after="40" w:before="140"/>
+      </w:pPr>
+      <w:r>
+        <w:rPr>
+          <w:b/>
+          <w:bCs/>
+          <w:color w:val="0B1B33"/>
+          <w:sz w:val="21"/>
+          <w:szCs w:val="21"/>
+        </w:rPr>
+        <w:t xml:space="preserve">Headline templates (≤40 chars)</w:t>
+      </w:r>
+    </w:p>
+    <w:p>
+      <w:pPr>
+        <w:pBdr>
+          <w:top w:val="single" w:color="C7D2E4" w:sz="6" w:space="8"/>
+          <w:bottom w:val="single" w:color="C7D2E4" w:sz="6" w:space="8"/>
+          <w:left w:val="single" w:color="2E6BC4" w:sz="18" w:space="8"/>
+          <w:right w:val="single" w:color="C7D2E4" w:sz="6" w:space="8"/>
+        </w:pBdr>
+        <w:shd w:fill="F3F6FB" w:val="clear"/>
+        <w:spacing w:after="140" w:before="60"/>
+        <w:ind w:left="120" w:right="120"/>
+      </w:pPr>
+      <w:r>
+        <w:rPr>
+          <w:rFonts w:ascii="Consolas" w:cs="Consolas" w:eastAsia="Consolas" w:hAnsi="Consolas"/>
+          <w:sz w:val="20"/>
+          <w:szCs w:val="20"/>
+        </w:rPr>
+        <w:t xml:space="preserve">[Benefit] in one place</w:t>
+      </w:r>
+      <w:r>
+        <w:rPr>
+          <w:rFonts w:ascii="Consolas" w:cs="Consolas" w:eastAsia="Consolas" w:hAnsi="Consolas"/>
+          <w:sz w:val="20"/>
+          <w:szCs w:val="20"/>
+        </w:rPr>
+        <w:br/>
+        <w:t xml:space="preserve">Meet marketwaros.com</w:t>
+      </w:r>
+      <w:r>
+        <w:rPr>
+          <w:rFonts w:ascii="Consolas" w:cs="Consolas" w:eastAsia="Consolas" w:hAnsi="Consolas"/>
+          <w:sz w:val="20"/>
+          <w:szCs w:val="20"/>
+        </w:rPr>
+        <w:br/>
+        <w:t xml:space="preserve">The new way to [job-to-be-done]</w:t>
+      </w:r>
+    </w:p>
+    <w:p>
+      <w:pPr>
+        <w:pStyle w:val="Heading1"/>
+      </w:pPr>
+      <w:r>
+        <w:t xml:space="preserve">12. Organic social captions (free posts — bonus)</w:t>
+      </w:r>
+    </w:p>
+    <w:p>
+      <w:pPr>
+        <w:spacing w:after="120"/>
+      </w:pPr>
+      <w:r>
+        <w:rPr>
+          <w:i/>
+          <w:iCs/>
+          <w:color w:val="5B6B85"/>
+        </w:rPr>
+        <w:t xml:space="preserve">Post these between ads to build the page. Feature-led, no budget needed.</w:t>
+      </w:r>
+    </w:p>
+    <w:p>
+      <w:pPr>
+        <w:pBdr>
+          <w:top w:val="single" w:color="C7D2E4" w:sz="6" w:space="8"/>
+          <w:bottom w:val="single" w:color="C7D2E4" w:sz="6" w:space="8"/>
+          <w:left w:val="single" w:color="2E6BC4" w:sz="18" w:space="8"/>
+          <w:right w:val="single" w:color="C7D2E4" w:sz="6" w:space="8"/>
+        </w:pBdr>
+        <w:shd w:fill="F3F6FB" w:val="clear"/>
+        <w:spacing w:after="140" w:before="60"/>
+        <w:ind w:left="120" w:right="120"/>
+      </w:pPr>
+      <w:r>
+        <w:rPr>
+          <w:rFonts w:ascii="Consolas" w:cs="Consolas" w:eastAsia="Consolas" w:hAnsi="Consolas"/>
+          <w:sz w:val="20"/>
+          <w:szCs w:val="20"/>
+        </w:rPr>
+        <w:t xml:space="preserve">POST 1 — “Cramming doesn’t work. Here’s what does.” Smart Review brings back exactly what you get wrong, at the perfect moment. Try it free → studyear.com/free</w:t>
+      </w:r>
+      <w:r>
+        <w:rPr>
+          <w:rFonts w:ascii="Consolas" w:cs="Consolas" w:eastAsia="Consolas" w:hAnsi="Consolas"/>
+          <w:sz w:val="20"/>
+          <w:szCs w:val="20"/>
+        </w:rPr>
+        <w:br/>
+        <w:t xml:space="preserve"/>
+      </w:r>
+      <w:r>
+        <w:rPr>
+          <w:rFonts w:ascii="Consolas" w:cs="Consolas" w:eastAsia="Consolas" w:hAnsi="Consolas"/>
+          <w:sz w:val="20"/>
+          <w:szCs w:val="20"/>
+        </w:rPr>
+        <w:br/>
+        <w:t xml:space="preserve">POST 2 — Your child’s predicted grade, from real marks, in 60 seconds. Free. No sign-up. studyear.com/free</w:t>
+      </w:r>
+      <w:r>
+        <w:rPr>
+          <w:rFonts w:ascii="Consolas" w:cs="Consolas" w:eastAsia="Consolas" w:hAnsi="Consolas"/>
+          <w:sz w:val="20"/>
+          <w:szCs w:val="20"/>
+        </w:rPr>
+        <w:br/>
+        <w:t xml:space="preserve"/>
+      </w:r>
+      <w:r>
+        <w:rPr>
+          <w:rFonts w:ascii="Consolas" w:cs="Consolas" w:eastAsia="Consolas" w:hAnsi="Consolas"/>
+          <w:sz w:val="20"/>
+          <w:szCs w:val="20"/>
+        </w:rPr>
+        <w:br/>
+        <w:t xml:space="preserve">POST 3 — An AI tutor that teaches the method, never just the answer. Any subject, any time. studyear.com/free</w:t>
+      </w:r>
+      <w:r>
+        <w:rPr>
+          <w:rFonts w:ascii="Consolas" w:cs="Consolas" w:eastAsia="Consolas" w:hAnsi="Consolas"/>
+          <w:sz w:val="20"/>
+          <w:szCs w:val="20"/>
+        </w:rPr>
+        <w:br/>
+        <w:t xml:space="preserve"/>
+      </w:r>
+      <w:r>
+        <w:rPr>
+          <w:rFonts w:ascii="Consolas" w:cs="Consolas" w:eastAsia="Consolas" w:hAnsi="Consolas"/>
+          <w:sz w:val="20"/>
+          <w:szCs w:val="20"/>
+        </w:rPr>
+        <w:br/>
+        <w:t xml:space="preserve">POST 4 — Sit the real exam before the real exam: timed past papers + mark schemes. studyear.com/free</w:t>
+      </w:r>
+    </w:p>
+    <w:p>
+      <w:pPr>
+        <w:spacing w:after="40" w:before="140"/>
+      </w:pPr>
+      <w:r>
+        <w:rPr>
+          <w:b/>
+          <w:bCs/>
+          <w:color w:val="0B1B33"/>
+          <w:sz w:val="21"/>
+          <w:szCs w:val="21"/>
+        </w:rPr>
+        <w:t xml:space="preserve">Hashtags (mix + rotate)</w:t>
+      </w:r>
+    </w:p>
+    <w:p>
+      <w:pPr>
+        <w:pBdr>
+          <w:top w:val="single" w:color="C7D2E4" w:sz="6" w:space="8"/>
+          <w:bottom w:val="single" w:color="C7D2E4" w:sz="6" w:space="8"/>
+          <w:left w:val="single" w:color="2E6BC4" w:sz="18" w:space="8"/>
+          <w:right w:val="single" w:color="C7D2E4" w:sz="6" w:space="8"/>
+        </w:pBdr>
+        <w:shd w:fill="F3F6FB" w:val="clear"/>
+        <w:spacing w:after="140" w:before="60"/>
+        <w:ind w:left="120" w:right="120"/>
+      </w:pPr>
+      <w:r>
+        <w:rPr>
+          <w:rFonts w:ascii="Consolas" w:cs="Consolas" w:eastAsia="Consolas" w:hAnsi="Consolas"/>
+          <w:sz w:val="20"/>
+          <w:szCs w:val="20"/>
+        </w:rPr>
+        <w:t xml:space="preserve">#GCSE #ALevel #revision #GCSErevision #studytips #UKschools #edtech #AItutor #examseason #parenting #homeschooluk #adultlearning</w:t>
       </w:r>
     </w:p>
     <w:p>

</xml_diff>